<commit_message>
Remove Docker project packaging
</commit_message>
<xml_diff>
--- a/docs/AdFlow-PRD-v1.2.docx
+++ b/docs/AdFlow-PRD-v1.2.docx
@@ -6484,7 +6484,7 @@
           <w:color w:val="172B3A"/>
           <w:sz w:val="21"/>
         </w:rPr>
-        <w:t>Docker Compose能够一条命令启动应用、MySQL和Redis。</w:t>
+        <w:t>提供清晰的本地启动说明；应用默认使用内存适配器，MySQL、Redis和Kafka可按需单独启用。</w:t>
       </w:r>
     </w:p>
     <w:p>
@@ -7769,7 +7769,7 @@
           <w:color w:val="172B3A"/>
           <w:sz w:val="21"/>
         </w:rPr>
-        <w:t>启动 Docker Compose，确认应用、MySQL、Redis健康。</w:t>
+        <w:t>按照README启动本地应用并确认健康检查通过；需要持久化或分布式能力时再启用相应基础设施。</w:t>
       </w:r>
     </w:p>
     <w:p>

</xml_diff>